<commit_message>
Update personas and rebuild quiz from latest hongrumen profile
</commit_message>
<xml_diff>
--- a/hongrumen.docx
+++ b/hongrumen.docx
@@ -23,6 +23,12 @@
         </w:rPr>
         <w:t>是黄芳女士的最爱</w:t>
       </w:r>
+      <w:r>
+        <w:rPr>
+          <w:rFonts w:hint="eastAsia"/>
+        </w:rPr>
+        <w:t>。喜欢在别人和自己毫无关系的社交媒体post下评论。</w:t>
+      </w:r>
     </w:p>
     <w:p/>
     <w:p>
@@ -40,6 +46,12 @@
         </w:rPr>
         <w:t>现居美国，喜欢看甄嬛传，喜欢在朋友圈发自己的照片，穿衣风格像中年大叔。很文艺，经常写诗。</w:t>
       </w:r>
+      <w:r>
+        <w:rPr>
+          <w:rFonts w:hint="eastAsia"/>
+        </w:rPr>
+        <w:t>很花心，谈过很多女朋友。</w:t>
+      </w:r>
     </w:p>
     <w:p/>
     <w:p>
@@ -67,7 +79,19 @@
         <w:rPr>
           <w:rFonts w:hint="eastAsia"/>
         </w:rPr>
-        <w:t>。是黄芳女士第二爱的。</w:t>
+        <w:t>。是黄芳女士第二爱的</w:t>
+      </w:r>
+      <w:r>
+        <w:rPr>
+          <w:rFonts w:hint="eastAsia"/>
+        </w:rPr>
+        <w:t>鸿儒</w:t>
+      </w:r>
+      <w:r>
+        <w:rPr>
+          <w:rFonts w:hint="eastAsia"/>
+        </w:rPr>
+        <w:t>。</w:t>
       </w:r>
     </w:p>
     <w:p/>
@@ -90,13 +114,41 @@
         <w:rPr>
           <w:rFonts w:hint="eastAsia"/>
         </w:rPr>
-        <w:t>apper，喜欢在网易云发说唱，会在女朋友过生日的时候给女朋友写一首歌发布在网易云上，艺名kreedom</w:t>
-      </w:r>
-      <w:r>
-        <w:rPr>
-          <w:rFonts w:hint="eastAsia"/>
-        </w:rPr>
-        <w:t>。曾经给腩子写小作文，夸腩子戴渔夫帽穿aape卫衣，是一个和他一样酷的人</w:t>
+        <w:t>apper，喜欢在网易云发说唱，会在女朋友过生日的时候给女朋友写一首歌发布在网易云上，艺名</w:t>
+      </w:r>
+      <w:proofErr w:type="spellStart"/>
+      <w:r>
+        <w:rPr>
+          <w:rFonts w:hint="eastAsia"/>
+        </w:rPr>
+        <w:t>kreedom</w:t>
+      </w:r>
+      <w:proofErr w:type="spellEnd"/>
+      <w:r>
+        <w:rPr>
+          <w:rFonts w:hint="eastAsia"/>
+        </w:rPr>
+        <w:t>。曾经给腩子写小作文，夸腩子戴渔夫帽穿</w:t>
+      </w:r>
+      <w:proofErr w:type="spellStart"/>
+      <w:r>
+        <w:rPr>
+          <w:rFonts w:hint="eastAsia"/>
+        </w:rPr>
+        <w:t>aape</w:t>
+      </w:r>
+      <w:proofErr w:type="spellEnd"/>
+      <w:r>
+        <w:rPr>
+          <w:rFonts w:hint="eastAsia"/>
+        </w:rPr>
+        <w:t>卫衣，是一个和他一样酷的人</w:t>
+      </w:r>
+      <w:r>
+        <w:rPr>
+          <w:rFonts w:hint="eastAsia"/>
+        </w:rPr>
+        <w:t>。送过腩子一条小狮子手链。</w:t>
       </w:r>
     </w:p>
     <w:p/>
@@ -130,7 +182,27 @@
         <w:rPr>
           <w:rFonts w:hint="eastAsia"/>
         </w:rPr>
-        <w:t>第一代鸿儒，在北郊的高中时期是草籽的敌人，草籽收集了他的黑料踩着他上位。和ltr有一段非常的关系</w:t>
+        <w:t>第一代鸿儒，在北郊的高中时期是草籽的敌人，草籽收集了他的黑料踩着他上位。和</w:t>
+      </w:r>
+      <w:proofErr w:type="spellStart"/>
+      <w:r>
+        <w:rPr>
+          <w:rFonts w:hint="eastAsia"/>
+        </w:rPr>
+        <w:t>ltr</w:t>
+      </w:r>
+      <w:proofErr w:type="spellEnd"/>
+      <w:r>
+        <w:rPr>
+          <w:rFonts w:hint="eastAsia"/>
+        </w:rPr>
+        <w:t>有一段非常的关系</w:t>
+      </w:r>
+      <w:r>
+        <w:rPr>
+          <w:rFonts w:hint="eastAsia"/>
+        </w:rPr>
+        <w:t>。</w:t>
       </w:r>
     </w:p>
     <w:p/>
@@ -155,6 +227,12 @@
         </w:rPr>
         <w:t>定位在澳大利亚约会。很自恋，说爬子和他戴一样的眼镜是暗恋他</w:t>
       </w:r>
+      <w:r>
+        <w:rPr>
+          <w:rFonts w:hint="eastAsia"/>
+        </w:rPr>
+        <w:t>。送给过腩子香水。</w:t>
+      </w:r>
     </w:p>
     <w:p/>
     <w:p>
@@ -170,7 +248,25 @@
         <w:rPr>
           <w:rFonts w:hint="eastAsia"/>
         </w:rPr>
-        <w:t>喜欢留长头发的男的。头发总是油油的，喜欢装逼，会弹吉他。搞了一个blender设计社群。曾经在深圳的腾讯实习，结果转正失败了，跟外界说是自己辞职了。</w:t>
+        <w:t>喜欢留长头发的男的。头发总是油油的，喜欢装逼，会弹吉他。搞了一个blender设计社群</w:t>
+      </w:r>
+      <w:r>
+        <w:rPr>
+          <w:rFonts w:hint="eastAsia"/>
+        </w:rPr>
+        <w:t>，感觉像个事业批，但其实天天打游戏</w:t>
+      </w:r>
+      <w:r>
+        <w:rPr>
+          <w:rFonts w:hint="eastAsia"/>
+        </w:rPr>
+        <w:t>。曾经在深圳的腾讯实习，结果转正失败了，跟外界说是自己辞职了。</w:t>
+      </w:r>
+      <w:r>
+        <w:rPr>
+          <w:rFonts w:hint="eastAsia"/>
+        </w:rPr>
+        <w:t>女朋友是一个在网易转正的建模大佬。</w:t>
       </w:r>
     </w:p>
     <w:p/>
@@ -187,7 +283,25 @@
         <w:rPr>
           <w:rFonts w:hint="eastAsia"/>
         </w:rPr>
-        <w:t>女朋友是超级大美女，喜欢穿像山本耀司黑乌鸦一样的黑大衣。喜欢在朋友圈发自己的阴湿美照</w:t>
+        <w:t>女朋友是超级大美女，</w:t>
+      </w:r>
+      <w:r>
+        <w:rPr>
+          <w:rFonts w:hint="eastAsia"/>
+        </w:rPr>
+        <w:t>女朋友曾经留短发像个帅T。</w:t>
+      </w:r>
+      <w:r>
+        <w:rPr>
+          <w:rFonts w:hint="eastAsia"/>
+        </w:rPr>
+        <w:t>喜欢穿像山本耀司黑乌鸦一样的黑大衣。喜欢在朋友圈发自己的阴湿美照</w:t>
+      </w:r>
+      <w:r>
+        <w:rPr>
+          <w:rFonts w:hint="eastAsia"/>
+        </w:rPr>
+        <w:t>。</w:t>
       </w:r>
     </w:p>
     <w:p/>
@@ -206,6 +320,12 @@
         </w:rPr>
         <w:t>设创的学生会主席，喜欢发自己的cos照，人称端王，江西人</w:t>
       </w:r>
+      <w:r>
+        <w:rPr>
+          <w:rFonts w:hint="eastAsia"/>
+        </w:rPr>
+        <w:t>。</w:t>
+      </w:r>
     </w:p>
     <w:p/>
     <w:p>
@@ -227,7 +347,14 @@
         <w:rPr>
           <w:rFonts w:hint="eastAsia"/>
         </w:rPr>
-        <w:t>，性取向未知，现居英国，喜欢叫别的男的老公，腩子的最爱。喜欢喝酒，是一个酒鬼。</w:t>
+        <w:t>，性取向未知，现居英国，喜欢叫别的男的老公，腩子的最爱。喜欢喝酒，是一个</w:t>
+      </w:r>
+      <w:r>
+        <w:rPr>
+          <w:rFonts w:hint="eastAsia"/>
+        </w:rPr>
+        <w:lastRenderedPageBreak/>
+        <w:t>酒鬼。</w:t>
       </w:r>
     </w:p>
     <w:p/>
@@ -236,16 +363,10 @@
         <w:rPr>
           <w:rFonts w:hint="eastAsia"/>
         </w:rPr>
-        <w:lastRenderedPageBreak/>
         <w:t>gig</w:t>
       </w:r>
     </w:p>
     <w:p>
-      <w:pPr>
-        <w:rPr>
-          <w:rFonts w:hint="eastAsia"/>
-        </w:rPr>
-      </w:pPr>
       <w:r>
         <w:rPr>
           <w:rFonts w:hint="eastAsia"/>
@@ -256,7 +377,39 @@
         <w:rPr>
           <w:rFonts w:hint="eastAsia"/>
         </w:rPr>
-        <w:t>头像说自己是变异向日葵。</w:t>
+        <w:t>头像</w:t>
+      </w:r>
+      <w:r>
+        <w:rPr>
+          <w:rFonts w:hint="eastAsia"/>
+        </w:rPr>
+        <w:t>上</w:t>
+      </w:r>
+      <w:r>
+        <w:rPr>
+          <w:rFonts w:hint="eastAsia"/>
+        </w:rPr>
+        <w:t>说自己是变异向日葵。</w:t>
+      </w:r>
+      <w:r>
+        <w:rPr>
+          <w:rFonts w:hint="eastAsia"/>
+        </w:rPr>
+        <w:t>也是一个事业批，</w:t>
+      </w:r>
+      <w:proofErr w:type="spellStart"/>
+      <w:r>
+        <w:rPr>
+          <w:rFonts w:hint="eastAsia"/>
+        </w:rPr>
+        <w:t>ig</w:t>
+      </w:r>
+      <w:proofErr w:type="spellEnd"/>
+      <w:r>
+        <w:rPr>
+          <w:rFonts w:hint="eastAsia"/>
+        </w:rPr>
+        <w:t>上发的都是自己的设计作品。</w:t>
       </w:r>
     </w:p>
     <w:sectPr>

</xml_diff>